<commit_message>
chore: consolidar cambios pendientes (CV sin anexos, fechas del legajo, referencias) y AGENTS.md como enlace a CLAUDE.md
Co-Authored-By: Claude Fable 5.1 <noreply@anthropic.com>
</commit_message>
<xml_diff>
--- a/assets/anexos/20250403 constancia de trabajo cau unsch.docx
+++ b/assets/anexos/20250403 constancia de trabajo cau unsch.docx
@@ -32,7 +32,7 @@
       </w:pPr>
       <w:r>
         <w:drawing>
-          <wp:anchor distT="0" distB="0" distL="114300" distR="114300" simplePos="0" relativeHeight="3" behindDoc="0" locked="0" layoutInCell="0" allowOverlap="1">
+          <wp:anchor distT="0" distB="0" distL="114300" distR="114300" simplePos="0" relativeHeight="2" behindDoc="0" locked="0" layoutInCell="0" allowOverlap="1">
             <wp:simplePos x="0" y="0"/>
             <wp:positionH relativeFrom="column">
               <wp:posOffset>-484505</wp:posOffset>
@@ -379,79 +379,7 @@
           <w:szCs w:val="24"/>
           <w:lang w:val="es-ES"/>
         </w:rPr>
-        <w:t xml:space="preserve"> con documento de identidad N° 76932189, laboró desde el </w:t>
-      </w:r>
-      <w:r>
-        <w:rPr>
-          <w:rFonts w:cs="Times New Roman" w:ascii="Times New Roman" w:hAnsi="Times New Roman"/>
-          <w:sz w:val="24"/>
-          <w:szCs w:val="24"/>
-          <w:lang w:val="es-ES"/>
-        </w:rPr>
-        <w:t>05</w:t>
-      </w:r>
-      <w:r>
-        <w:rPr>
-          <w:rFonts w:cs="Times New Roman" w:ascii="Times New Roman" w:hAnsi="Times New Roman"/>
-          <w:sz w:val="24"/>
-          <w:szCs w:val="24"/>
-          <w:lang w:val="es-ES"/>
-        </w:rPr>
-        <w:t xml:space="preserve"> de </w:t>
-      </w:r>
-      <w:r>
-        <w:rPr>
-          <w:rFonts w:cs="Times New Roman" w:ascii="Times New Roman" w:hAnsi="Times New Roman"/>
-          <w:sz w:val="24"/>
-          <w:szCs w:val="24"/>
-          <w:lang w:val="es-ES"/>
-        </w:rPr>
-        <w:t>enero</w:t>
-      </w:r>
-      <w:r>
-        <w:rPr>
-          <w:rFonts w:cs="Times New Roman" w:ascii="Times New Roman" w:hAnsi="Times New Roman"/>
-          <w:sz w:val="24"/>
-          <w:szCs w:val="24"/>
-          <w:lang w:val="es-ES"/>
-        </w:rPr>
-        <w:t xml:space="preserve"> del 2025 hasta 28 de </w:t>
-      </w:r>
-      <w:r>
-        <w:rPr>
-          <w:rFonts w:cs="Times New Roman" w:ascii="Times New Roman" w:hAnsi="Times New Roman"/>
-          <w:sz w:val="24"/>
-          <w:szCs w:val="24"/>
-          <w:lang w:val="es-ES"/>
-        </w:rPr>
-        <w:t>marzo</w:t>
-      </w:r>
-      <w:r>
-        <w:rPr>
-          <w:rFonts w:cs="Times New Roman" w:ascii="Times New Roman" w:hAnsi="Times New Roman"/>
-          <w:sz w:val="24"/>
-          <w:szCs w:val="24"/>
-          <w:lang w:val="es-ES"/>
-        </w:rPr>
-        <w:t xml:space="preserve"> de 202</w:t>
-      </w:r>
-      <w:r>
-        <w:rPr>
-          <w:rFonts w:cs="Times New Roman" w:ascii="Times New Roman" w:hAnsi="Times New Roman"/>
-          <w:sz w:val="24"/>
-          <w:szCs w:val="24"/>
-          <w:lang w:val="es-ES"/>
-        </w:rPr>
-        <w:t>5</w:t>
-      </w:r>
-      <w:r>
-        <w:rPr>
-          <w:rFonts w:cs="Times New Roman" w:ascii="Times New Roman" w:hAnsi="Times New Roman"/>
-          <w:sz w:val="24"/>
-          <w:szCs w:val="24"/>
-          <w:lang w:val="es-ES"/>
-        </w:rPr>
-        <w:t xml:space="preserve"> como </w:t>
+        <w:t xml:space="preserve"> con documento de identidad N° 76932189, laboró desde el 06 de enero del 2025 hasta 28 de marzo de 2025 como </w:t>
       </w:r>
       <w:r>
         <w:rPr>
@@ -550,19 +478,47 @@
         </w:rPr>
       </w:pPr>
       <w:r>
+        <w:rPr>
+          <w:rFonts w:cs="Times New Roman" w:ascii="Times New Roman" w:hAnsi="Times New Roman"/>
+          <w:sz w:val="24"/>
+          <w:szCs w:val="24"/>
+          <w:lang w:val="es-ES"/>
+        </w:rPr>
+        <w:t>Ayacucho, 3 de abril del 2025</w:t>
+      </w:r>
+    </w:p>
+    <w:p>
+      <w:pPr>
+        <w:pStyle w:val="Normal"/>
+        <w:spacing w:lineRule="auto" w:line="480"/>
+        <w:jc w:val="both"/>
+        <w:rPr>
+          <w:rFonts w:ascii="Times New Roman" w:hAnsi="Times New Roman" w:cs="Times New Roman"/>
+          <w:sz w:val="24"/>
+          <w:szCs w:val="24"/>
+          <w:lang w:val="es-ES"/>
+        </w:rPr>
+      </w:pPr>
+      <w:r>
+        <w:rPr>
+          <w:rFonts w:cs="Times New Roman" w:ascii="Times New Roman" w:hAnsi="Times New Roman"/>
+          <w:sz w:val="24"/>
+          <w:szCs w:val="24"/>
+          <w:lang w:val="es-ES"/>
+        </w:rPr>
         <w:drawing>
-          <wp:anchor distT="0" distB="0" distL="0" distR="0" simplePos="0" relativeHeight="2" behindDoc="1" locked="0" layoutInCell="1" allowOverlap="1">
+          <wp:anchor distT="0" distB="0" distL="0" distR="0" simplePos="0" relativeHeight="3" behindDoc="0" locked="0" layoutInCell="1" allowOverlap="1">
             <wp:simplePos x="0" y="0"/>
             <wp:positionH relativeFrom="column">
-              <wp:posOffset>1828800</wp:posOffset>
+              <wp:posOffset>1847215</wp:posOffset>
             </wp:positionH>
             <wp:positionV relativeFrom="paragraph">
-              <wp:posOffset>278765</wp:posOffset>
+              <wp:posOffset>157480</wp:posOffset>
             </wp:positionV>
-            <wp:extent cx="2092960" cy="1415415"/>
+            <wp:extent cx="1663700" cy="1115060"/>
             <wp:effectExtent l="0" t="0" r="0" b="0"/>
             <wp:wrapNone/>
-            <wp:docPr id="2" name="Imagen 2"/>
+            <wp:docPr id="2" name="Image1"/>
             <wp:cNvGraphicFramePr>
               <a:graphicFrameLocks xmlns:a="http://schemas.openxmlformats.org/drawingml/2006/main" noChangeAspect="1"/>
             </wp:cNvGraphicFramePr>
@@ -570,14 +526,13 @@
               <a:graphicData uri="http://schemas.openxmlformats.org/drawingml/2006/picture">
                 <pic:pic xmlns:pic="http://schemas.openxmlformats.org/drawingml/2006/picture">
                   <pic:nvPicPr>
-                    <pic:cNvPr id="2" name="Imagen 2"/>
+                    <pic:cNvPr id="2" name="Image1"/>
                     <pic:cNvPicPr>
                       <a:picLocks noChangeAspect="1" noChangeArrowheads="1"/>
                     </pic:cNvPicPr>
                   </pic:nvPicPr>
                   <pic:blipFill>
                     <a:blip r:embed="rId4"/>
-                    <a:srcRect l="8904" t="14219" r="6902" b="14779"/>
                     <a:stretch>
                       <a:fillRect/>
                     </a:stretch>
@@ -585,7 +540,7 @@
                   <pic:spPr bwMode="auto">
                     <a:xfrm>
                       <a:off x="0" y="0"/>
-                      <a:ext cx="2092960" cy="1415415"/>
+                      <a:ext cx="1663700" cy="1115060"/>
                     </a:xfrm>
                     <a:prstGeom prst="rect">
                       <a:avLst/>
@@ -597,81 +552,6 @@
             </a:graphic>
           </wp:anchor>
         </w:drawing>
-      </w:r>
-      <w:r>
-        <w:rPr>
-          <w:rFonts w:cs="Times New Roman" w:ascii="Times New Roman" w:hAnsi="Times New Roman"/>
-          <w:sz w:val="24"/>
-          <w:szCs w:val="24"/>
-          <w:lang w:val="es-ES"/>
-        </w:rPr>
-        <w:t xml:space="preserve">Ayacucho, </w:t>
-      </w:r>
-      <w:r>
-        <w:rPr>
-          <w:rFonts w:cs="Times New Roman" w:ascii="Times New Roman" w:hAnsi="Times New Roman"/>
-          <w:sz w:val="24"/>
-          <w:szCs w:val="24"/>
-          <w:lang w:val="es-ES"/>
-        </w:rPr>
-        <w:t>3</w:t>
-      </w:r>
-      <w:r>
-        <w:rPr>
-          <w:rFonts w:cs="Times New Roman" w:ascii="Times New Roman" w:hAnsi="Times New Roman"/>
-          <w:sz w:val="24"/>
-          <w:szCs w:val="24"/>
-          <w:lang w:val="es-ES"/>
-        </w:rPr>
-        <w:t xml:space="preserve"> de </w:t>
-      </w:r>
-      <w:r>
-        <w:rPr>
-          <w:rFonts w:cs="Times New Roman" w:ascii="Times New Roman" w:hAnsi="Times New Roman"/>
-          <w:sz w:val="24"/>
-          <w:szCs w:val="24"/>
-          <w:lang w:val="es-ES"/>
-        </w:rPr>
-        <w:t>abril</w:t>
-      </w:r>
-      <w:r>
-        <w:rPr>
-          <w:rFonts w:cs="Times New Roman" w:ascii="Times New Roman" w:hAnsi="Times New Roman"/>
-          <w:sz w:val="24"/>
-          <w:szCs w:val="24"/>
-          <w:lang w:val="es-ES"/>
-        </w:rPr>
-        <w:t xml:space="preserve"> del 202</w:t>
-      </w:r>
-      <w:r>
-        <w:rPr>
-          <w:rFonts w:cs="Times New Roman" w:ascii="Times New Roman" w:hAnsi="Times New Roman"/>
-          <w:sz w:val="24"/>
-          <w:szCs w:val="24"/>
-          <w:lang w:val="es-ES"/>
-        </w:rPr>
-        <w:t>5</w:t>
-      </w:r>
-    </w:p>
-    <w:p>
-      <w:pPr>
-        <w:pStyle w:val="Normal"/>
-        <w:spacing w:lineRule="auto" w:line="480"/>
-        <w:jc w:val="both"/>
-        <w:rPr>
-          <w:rFonts w:ascii="Times New Roman" w:hAnsi="Times New Roman" w:cs="Times New Roman"/>
-          <w:sz w:val="24"/>
-          <w:szCs w:val="24"/>
-          <w:lang w:val="es-ES"/>
-        </w:rPr>
-      </w:pPr>
-      <w:r>
-        <w:rPr>
-          <w:rFonts w:cs="Times New Roman" w:ascii="Times New Roman" w:hAnsi="Times New Roman"/>
-          <w:sz w:val="24"/>
-          <w:szCs w:val="24"/>
-          <w:lang w:val="es-ES"/>
-        </w:rPr>
       </w:r>
     </w:p>
     <w:p>

</xml_diff>